<commit_message>
add testing report, some visual changes in credential service
</commit_message>
<xml_diff>
--- a/Docs/Тест-кейсы.docx
+++ b/Docs/Тест-кейсы.docx
@@ -69,7 +69,13 @@
     </w:p>
     <w:p>
       <w:r>
-        <w:t>Табличка с корректными данными</w:t>
+        <w:t>Табли</w:t>
+      </w:r>
+      <w:r>
+        <w:t>ца</w:t>
+      </w:r>
+      <w:r>
+        <w:t xml:space="preserve"> с корректными данными</w:t>
       </w:r>
       <w:r>
         <w:t>:</w:t>
@@ -795,6 +801,7 @@
               <w:rPr>
                 <w:sz w:val="24"/>
                 <w:szCs w:val="24"/>
+                <w:lang w:val="en-US"/>
               </w:rPr>
             </w:pPr>
             <w:r>
@@ -802,7 +809,41 @@
                 <w:sz w:val="24"/>
                 <w:szCs w:val="24"/>
               </w:rPr>
-              <w:t>Сообщение: Ошибка подключения</w:t>
+              <w:t>Сообщение</w:t>
+            </w:r>
+            <w:r>
+              <w:rPr>
+                <w:sz w:val="24"/>
+                <w:szCs w:val="24"/>
+                <w:lang w:val="en-US"/>
+              </w:rPr>
+              <w:t xml:space="preserve">: </w:t>
+            </w:r>
+            <w:r>
+              <w:rPr>
+                <w:sz w:val="24"/>
+                <w:szCs w:val="24"/>
+                <w:lang w:val="en-US"/>
+              </w:rPr>
+              <w:t xml:space="preserve">Failed to connect to </w:t>
+            </w:r>
+            <w:proofErr w:type="spellStart"/>
+            <w:r>
+              <w:rPr>
+                <w:sz w:val="24"/>
+                <w:szCs w:val="24"/>
+                <w:lang w:val="en-US"/>
+              </w:rPr>
+              <w:t>ip</w:t>
+            </w:r>
+            <w:proofErr w:type="spellEnd"/>
+            <w:r>
+              <w:rPr>
+                <w:sz w:val="24"/>
+                <w:szCs w:val="24"/>
+                <w:lang w:val="en-US"/>
+              </w:rPr>
+              <w:t>****</w:t>
             </w:r>
           </w:p>
         </w:tc>
@@ -849,6 +890,7 @@
               <w:rPr>
                 <w:sz w:val="24"/>
                 <w:szCs w:val="24"/>
+                <w:lang w:val="en-US"/>
               </w:rPr>
             </w:pPr>
             <w:r>
@@ -856,7 +898,41 @@
                 <w:sz w:val="24"/>
                 <w:szCs w:val="24"/>
               </w:rPr>
-              <w:t>Сообщение: Ошибка подключения</w:t>
+              <w:t>Сообщение</w:t>
+            </w:r>
+            <w:r>
+              <w:rPr>
+                <w:sz w:val="24"/>
+                <w:szCs w:val="24"/>
+                <w:lang w:val="en-US"/>
+              </w:rPr>
+              <w:t xml:space="preserve">: </w:t>
+            </w:r>
+            <w:r>
+              <w:rPr>
+                <w:sz w:val="24"/>
+                <w:szCs w:val="24"/>
+                <w:lang w:val="en-US"/>
+              </w:rPr>
+              <w:t xml:space="preserve">Failed to connect to </w:t>
+            </w:r>
+            <w:proofErr w:type="spellStart"/>
+            <w:r>
+              <w:rPr>
+                <w:sz w:val="24"/>
+                <w:szCs w:val="24"/>
+                <w:lang w:val="en-US"/>
+              </w:rPr>
+              <w:t>ip</w:t>
+            </w:r>
+            <w:proofErr w:type="spellEnd"/>
+            <w:r>
+              <w:rPr>
+                <w:sz w:val="24"/>
+                <w:szCs w:val="24"/>
+                <w:lang w:val="en-US"/>
+              </w:rPr>
+              <w:t>****</w:t>
             </w:r>
           </w:p>
         </w:tc>
@@ -1018,122 +1094,6 @@
                 <w:szCs w:val="24"/>
               </w:rPr>
               <w:t xml:space="preserve">Вы удачно авторизовались. </w:t>
-            </w:r>
-          </w:p>
-          <w:p>
-            <w:pPr>
-              <w:jc w:val="left"/>
-              <w:rPr>
-                <w:sz w:val="24"/>
-                <w:szCs w:val="24"/>
-              </w:rPr>
-            </w:pPr>
-            <w:r>
-              <w:rPr>
-                <w:sz w:val="24"/>
-                <w:szCs w:val="24"/>
-              </w:rPr>
-              <w:t xml:space="preserve">На удаленном компьютере началась активная сессия  </w:t>
-            </w:r>
-            <w:proofErr w:type="spellStart"/>
-            <w:r>
-              <w:rPr>
-                <w:sz w:val="24"/>
-                <w:szCs w:val="24"/>
-              </w:rPr>
-              <w:t>ИмяПользователя</w:t>
-            </w:r>
-            <w:proofErr w:type="spellEnd"/>
-            <w:r>
-              <w:rPr>
-                <w:sz w:val="24"/>
-                <w:szCs w:val="24"/>
-              </w:rPr>
-              <w:t>.</w:t>
-            </w:r>
-          </w:p>
-        </w:tc>
-      </w:tr>
-      <w:tr>
-        <w:tc>
-          <w:tcPr>
-            <w:tcW w:w="4785" w:type="dxa"/>
-          </w:tcPr>
-          <w:p>
-            <w:pPr>
-              <w:jc w:val="left"/>
-              <w:rPr>
-                <w:sz w:val="24"/>
-                <w:szCs w:val="24"/>
-              </w:rPr>
-            </w:pPr>
-            <w:r>
-              <w:rPr>
-                <w:sz w:val="24"/>
-                <w:szCs w:val="24"/>
-              </w:rPr>
-              <w:t xml:space="preserve">На удаленном компьютере запущена служба </w:t>
-            </w:r>
-            <w:proofErr w:type="spellStart"/>
-            <w:r>
-              <w:rPr>
-                <w:sz w:val="24"/>
-                <w:szCs w:val="24"/>
-                <w:lang w:val="en-US"/>
-              </w:rPr>
-              <w:t>CredentialService</w:t>
-            </w:r>
-            <w:proofErr w:type="spellEnd"/>
-            <w:r>
-              <w:rPr>
-                <w:sz w:val="24"/>
-                <w:szCs w:val="24"/>
-              </w:rPr>
-              <w:t xml:space="preserve"> и нет активной сесси</w:t>
-            </w:r>
-            <w:proofErr w:type="gramStart"/>
-            <w:r>
-              <w:rPr>
-                <w:sz w:val="24"/>
-                <w:szCs w:val="24"/>
-              </w:rPr>
-              <w:t>и(</w:t>
-            </w:r>
-            <w:proofErr w:type="gramEnd"/>
-            <w:r>
-              <w:rPr>
-                <w:sz w:val="24"/>
-                <w:szCs w:val="24"/>
-              </w:rPr>
-              <w:t>другой пользователь вводит свои данные)</w:t>
-            </w:r>
-          </w:p>
-        </w:tc>
-        <w:tc>
-          <w:tcPr>
-            <w:tcW w:w="4786" w:type="dxa"/>
-          </w:tcPr>
-          <w:p>
-            <w:pPr>
-              <w:jc w:val="left"/>
-              <w:rPr>
-                <w:sz w:val="24"/>
-                <w:szCs w:val="24"/>
-              </w:rPr>
-            </w:pPr>
-            <w:r>
-              <w:rPr>
-                <w:sz w:val="24"/>
-                <w:szCs w:val="24"/>
-              </w:rPr>
-              <w:t>Сообщение:</w:t>
-            </w:r>
-            <w:r>
-              <w:rPr>
-                <w:sz w:val="24"/>
-                <w:szCs w:val="24"/>
-              </w:rPr>
-              <w:t xml:space="preserve"> Вы удачно авторизовались.</w:t>
             </w:r>
           </w:p>
           <w:p>
@@ -1651,6 +1611,7 @@
               <w:rPr>
                 <w:sz w:val="24"/>
                 <w:szCs w:val="24"/>
+                <w:lang w:val="en-US"/>
               </w:rPr>
             </w:pPr>
             <w:r>
@@ -1658,7 +1619,49 @@
                 <w:sz w:val="24"/>
                 <w:szCs w:val="24"/>
               </w:rPr>
-              <w:t>Сообщение: Ошибка подключения</w:t>
+              <w:t>Сообщение</w:t>
+            </w:r>
+            <w:r>
+              <w:rPr>
+                <w:sz w:val="24"/>
+                <w:szCs w:val="24"/>
+                <w:lang w:val="en-US"/>
+              </w:rPr>
+              <w:t>:</w:t>
+            </w:r>
+            <w:r>
+              <w:rPr>
+                <w:sz w:val="24"/>
+                <w:szCs w:val="24"/>
+                <w:lang w:val="en-US"/>
+              </w:rPr>
+              <w:t xml:space="preserve"> </w:t>
+            </w:r>
+            <w:r>
+              <w:rPr>
+                <w:sz w:val="24"/>
+                <w:szCs w:val="24"/>
+                <w:lang w:val="en-US"/>
+              </w:rPr>
+              <w:t xml:space="preserve">Failed to connect to </w:t>
+            </w:r>
+            <w:proofErr w:type="spellStart"/>
+            <w:r>
+              <w:rPr>
+                <w:sz w:val="24"/>
+                <w:szCs w:val="24"/>
+                <w:lang w:val="en-US"/>
+              </w:rPr>
+              <w:t>ip</w:t>
+            </w:r>
+            <w:proofErr w:type="spellEnd"/>
+            <w:r>
+              <w:rPr>
+                <w:sz w:val="24"/>
+                <w:szCs w:val="24"/>
+                <w:lang w:val="en-US"/>
+              </w:rPr>
+              <w:t>****</w:t>
             </w:r>
             <w:r>
               <w:rPr>
@@ -1666,7 +1669,7 @@
                 <w:szCs w:val="24"/>
                 <w:lang w:val="uk-UA"/>
               </w:rPr>
-              <w:t xml:space="preserve">. </w:t>
+              <w:t xml:space="preserve"> </w:t>
             </w:r>
           </w:p>
         </w:tc>
@@ -1713,6 +1716,7 @@
               <w:rPr>
                 <w:sz w:val="24"/>
                 <w:szCs w:val="24"/>
+                <w:lang w:val="en-US"/>
               </w:rPr>
             </w:pPr>
             <w:r>
@@ -1720,7 +1724,41 @@
                 <w:sz w:val="24"/>
                 <w:szCs w:val="24"/>
               </w:rPr>
-              <w:t>Сообщение: Ошибка подключения</w:t>
+              <w:t>Сообщение</w:t>
+            </w:r>
+            <w:r>
+              <w:rPr>
+                <w:sz w:val="24"/>
+                <w:szCs w:val="24"/>
+                <w:lang w:val="en-US"/>
+              </w:rPr>
+              <w:t xml:space="preserve">: </w:t>
+            </w:r>
+            <w:r>
+              <w:rPr>
+                <w:sz w:val="24"/>
+                <w:szCs w:val="24"/>
+                <w:lang w:val="en-US"/>
+              </w:rPr>
+              <w:t xml:space="preserve">Failed to connect to </w:t>
+            </w:r>
+            <w:proofErr w:type="spellStart"/>
+            <w:r>
+              <w:rPr>
+                <w:sz w:val="24"/>
+                <w:szCs w:val="24"/>
+                <w:lang w:val="en-US"/>
+              </w:rPr>
+              <w:t>ip</w:t>
+            </w:r>
+            <w:proofErr w:type="spellEnd"/>
+            <w:r>
+              <w:rPr>
+                <w:sz w:val="24"/>
+                <w:szCs w:val="24"/>
+                <w:lang w:val="en-US"/>
+              </w:rPr>
+              <w:t>****</w:t>
             </w:r>
           </w:p>
         </w:tc>
@@ -1774,6 +1812,7 @@
               <w:rPr>
                 <w:sz w:val="24"/>
                 <w:szCs w:val="24"/>
+                <w:lang w:val="en-US"/>
               </w:rPr>
             </w:pPr>
             <w:r>
@@ -1781,7 +1820,41 @@
                 <w:sz w:val="24"/>
                 <w:szCs w:val="24"/>
               </w:rPr>
-              <w:t>Сообщение: Ошибка подключения</w:t>
+              <w:t>Сообщение</w:t>
+            </w:r>
+            <w:r>
+              <w:rPr>
+                <w:sz w:val="24"/>
+                <w:szCs w:val="24"/>
+                <w:lang w:val="en-US"/>
+              </w:rPr>
+              <w:t xml:space="preserve">: </w:t>
+            </w:r>
+            <w:r>
+              <w:rPr>
+                <w:sz w:val="24"/>
+                <w:szCs w:val="24"/>
+                <w:lang w:val="en-US"/>
+              </w:rPr>
+              <w:t xml:space="preserve">Failed to connect to </w:t>
+            </w:r>
+            <w:proofErr w:type="spellStart"/>
+            <w:r>
+              <w:rPr>
+                <w:sz w:val="24"/>
+                <w:szCs w:val="24"/>
+                <w:lang w:val="en-US"/>
+              </w:rPr>
+              <w:t>ip</w:t>
+            </w:r>
+            <w:proofErr w:type="spellEnd"/>
+            <w:r>
+              <w:rPr>
+                <w:sz w:val="24"/>
+                <w:szCs w:val="24"/>
+                <w:lang w:val="en-US"/>
+              </w:rPr>
+              <w:t>****</w:t>
             </w:r>
           </w:p>
         </w:tc>
@@ -1851,6 +1924,7 @@
               <w:rPr>
                 <w:sz w:val="24"/>
                 <w:szCs w:val="24"/>
+                <w:lang w:val="en-US"/>
               </w:rPr>
             </w:pPr>
             <w:r>
@@ -1858,30 +1932,23 @@
                 <w:sz w:val="24"/>
                 <w:szCs w:val="24"/>
               </w:rPr>
-              <w:t>Сообщение: Ошибка подключения</w:t>
-            </w:r>
-          </w:p>
-        </w:tc>
-      </w:tr>
-      <w:tr>
-        <w:tc>
-          <w:tcPr>
-            <w:tcW w:w="4785" w:type="dxa"/>
-          </w:tcPr>
-          <w:p>
-            <w:pPr>
-              <w:jc w:val="left"/>
-              <w:rPr>
-                <w:sz w:val="24"/>
-                <w:szCs w:val="24"/>
-              </w:rPr>
-            </w:pPr>
-            <w:r>
-              <w:rPr>
-                <w:sz w:val="24"/>
-                <w:szCs w:val="24"/>
-              </w:rPr>
-              <w:t xml:space="preserve">На удаленном компьютере запущена служба </w:t>
+              <w:t>Сообщение</w:t>
+            </w:r>
+            <w:r>
+              <w:rPr>
+                <w:sz w:val="24"/>
+                <w:szCs w:val="24"/>
+                <w:lang w:val="en-US"/>
+              </w:rPr>
+              <w:t xml:space="preserve">: </w:t>
+            </w:r>
+            <w:r>
+              <w:rPr>
+                <w:sz w:val="24"/>
+                <w:szCs w:val="24"/>
+                <w:lang w:val="en-US"/>
+              </w:rPr>
+              <w:t xml:space="preserve">Failed to connect to </w:t>
             </w:r>
             <w:proofErr w:type="spellStart"/>
             <w:r>
@@ -1890,60 +1957,38 @@
                 <w:szCs w:val="24"/>
                 <w:lang w:val="en-US"/>
               </w:rPr>
-              <w:t>CredentialService</w:t>
+              <w:t>ip</w:t>
             </w:r>
             <w:proofErr w:type="spellEnd"/>
             <w:r>
               <w:rPr>
                 <w:sz w:val="24"/>
                 <w:szCs w:val="24"/>
-              </w:rPr>
-              <w:t xml:space="preserve"> и нет активной сесси</w:t>
-            </w:r>
-            <w:proofErr w:type="gramStart"/>
-            <w:r>
-              <w:rPr>
-                <w:sz w:val="24"/>
-                <w:szCs w:val="24"/>
-              </w:rPr>
-              <w:t>и(</w:t>
-            </w:r>
-            <w:proofErr w:type="gramEnd"/>
-            <w:r>
-              <w:rPr>
-                <w:sz w:val="24"/>
-                <w:szCs w:val="24"/>
-              </w:rPr>
-              <w:t>другой пользователь вводит свои данные)</w:t>
-            </w:r>
-          </w:p>
-        </w:tc>
-        <w:tc>
-          <w:tcPr>
-            <w:tcW w:w="4786" w:type="dxa"/>
-          </w:tcPr>
-          <w:p>
-            <w:pPr>
-              <w:jc w:val="left"/>
-              <w:rPr>
-                <w:sz w:val="24"/>
-                <w:szCs w:val="24"/>
-              </w:rPr>
-            </w:pPr>
-            <w:r>
-              <w:rPr>
-                <w:sz w:val="24"/>
-                <w:szCs w:val="24"/>
-              </w:rPr>
-              <w:t>Сообщение: Ошибка подключения</w:t>
+                <w:lang w:val="en-US"/>
+              </w:rPr>
+              <w:t>****</w:t>
             </w:r>
           </w:p>
         </w:tc>
       </w:tr>
     </w:tbl>
-    <w:p/>
     <w:p>
-      <w:r>
+      <w:pPr>
+        <w:rPr>
+          <w:lang w:val="en-US"/>
+        </w:rPr>
+      </w:pPr>
+    </w:p>
+    <w:p>
+      <w:pPr>
+        <w:rPr>
+          <w:lang w:val="en-US"/>
+        </w:rPr>
+      </w:pPr>
+      <w:r>
+        <w:rPr>
+          <w:lang w:val="en-US"/>
+        </w:rPr>
         <w:br w:type="page"/>
       </w:r>
     </w:p>
@@ -2350,6 +2395,7 @@
               <w:rPr>
                 <w:sz w:val="24"/>
                 <w:szCs w:val="24"/>
+                <w:lang w:val="en-US"/>
               </w:rPr>
             </w:pPr>
             <w:r>
@@ -2357,7 +2403,41 @@
                 <w:sz w:val="24"/>
                 <w:szCs w:val="24"/>
               </w:rPr>
-              <w:t>Сообщение: Ошибка подключения</w:t>
+              <w:t>Сообщение</w:t>
+            </w:r>
+            <w:r>
+              <w:rPr>
+                <w:sz w:val="24"/>
+                <w:szCs w:val="24"/>
+                <w:lang w:val="en-US"/>
+              </w:rPr>
+              <w:t xml:space="preserve">: </w:t>
+            </w:r>
+            <w:r>
+              <w:rPr>
+                <w:sz w:val="24"/>
+                <w:szCs w:val="24"/>
+                <w:lang w:val="en-US"/>
+              </w:rPr>
+              <w:t xml:space="preserve">Failed to connect to </w:t>
+            </w:r>
+            <w:proofErr w:type="spellStart"/>
+            <w:r>
+              <w:rPr>
+                <w:sz w:val="24"/>
+                <w:szCs w:val="24"/>
+                <w:lang w:val="en-US"/>
+              </w:rPr>
+              <w:t>ip</w:t>
+            </w:r>
+            <w:proofErr w:type="spellEnd"/>
+            <w:r>
+              <w:rPr>
+                <w:sz w:val="24"/>
+                <w:szCs w:val="24"/>
+                <w:lang w:val="en-US"/>
+              </w:rPr>
+              <w:t>****</w:t>
             </w:r>
           </w:p>
         </w:tc>
@@ -2404,6 +2484,7 @@
               <w:rPr>
                 <w:sz w:val="24"/>
                 <w:szCs w:val="24"/>
+                <w:lang w:val="en-US"/>
               </w:rPr>
             </w:pPr>
             <w:r>
@@ -2411,7 +2492,41 @@
                 <w:sz w:val="24"/>
                 <w:szCs w:val="24"/>
               </w:rPr>
-              <w:t>Сообщение: Ошибка подключения</w:t>
+              <w:t>Сообщение</w:t>
+            </w:r>
+            <w:r>
+              <w:rPr>
+                <w:sz w:val="24"/>
+                <w:szCs w:val="24"/>
+                <w:lang w:val="en-US"/>
+              </w:rPr>
+              <w:t xml:space="preserve">: </w:t>
+            </w:r>
+            <w:r>
+              <w:rPr>
+                <w:sz w:val="24"/>
+                <w:szCs w:val="24"/>
+                <w:lang w:val="en-US"/>
+              </w:rPr>
+              <w:t xml:space="preserve">Failed to connect to </w:t>
+            </w:r>
+            <w:proofErr w:type="spellStart"/>
+            <w:r>
+              <w:rPr>
+                <w:sz w:val="24"/>
+                <w:szCs w:val="24"/>
+                <w:lang w:val="en-US"/>
+              </w:rPr>
+              <w:t>ip</w:t>
+            </w:r>
+            <w:proofErr w:type="spellEnd"/>
+            <w:r>
+              <w:rPr>
+                <w:sz w:val="24"/>
+                <w:szCs w:val="24"/>
+                <w:lang w:val="en-US"/>
+              </w:rPr>
+              <w:t>****</w:t>
             </w:r>
           </w:p>
         </w:tc>
@@ -2574,89 +2689,20 @@
               </w:rPr>
               <w:t>Ошибка авторизации. Неверный логин</w:t>
             </w:r>
-          </w:p>
-        </w:tc>
-      </w:tr>
-      <w:tr>
-        <w:tc>
-          <w:tcPr>
-            <w:tcW w:w="4785" w:type="dxa"/>
-          </w:tcPr>
-          <w:p>
-            <w:pPr>
-              <w:jc w:val="left"/>
-              <w:rPr>
-                <w:sz w:val="24"/>
-                <w:szCs w:val="24"/>
-              </w:rPr>
-            </w:pPr>
-            <w:r>
-              <w:rPr>
-                <w:sz w:val="24"/>
-                <w:szCs w:val="24"/>
-              </w:rPr>
-              <w:t xml:space="preserve">На удаленном компьютере запущена служба </w:t>
-            </w:r>
-            <w:proofErr w:type="spellStart"/>
             <w:r>
               <w:rPr>
                 <w:sz w:val="24"/>
                 <w:szCs w:val="24"/>
                 <w:lang w:val="en-US"/>
               </w:rPr>
-              <w:t>CredentialService</w:t>
-            </w:r>
-            <w:proofErr w:type="spellEnd"/>
-            <w:r>
-              <w:rPr>
-                <w:sz w:val="24"/>
-                <w:szCs w:val="24"/>
-              </w:rPr>
-              <w:t xml:space="preserve"> и нет активной сесси</w:t>
-            </w:r>
-            <w:proofErr w:type="gramStart"/>
-            <w:r>
-              <w:rPr>
-                <w:sz w:val="24"/>
-                <w:szCs w:val="24"/>
-              </w:rPr>
-              <w:t>и(</w:t>
-            </w:r>
-            <w:proofErr w:type="gramEnd"/>
-            <w:r>
-              <w:rPr>
-                <w:sz w:val="24"/>
-                <w:szCs w:val="24"/>
-              </w:rPr>
-              <w:t>другой пользователь вводит свои данные)</w:t>
-            </w:r>
-          </w:p>
-        </w:tc>
-        <w:tc>
-          <w:tcPr>
-            <w:tcW w:w="4786" w:type="dxa"/>
-          </w:tcPr>
-          <w:p>
-            <w:pPr>
-              <w:jc w:val="left"/>
-              <w:rPr>
-                <w:sz w:val="24"/>
-                <w:szCs w:val="24"/>
-              </w:rPr>
-            </w:pPr>
-            <w:r>
-              <w:rPr>
-                <w:sz w:val="24"/>
-                <w:szCs w:val="24"/>
-              </w:rPr>
-              <w:t>Сообщение:</w:t>
-            </w:r>
-            <w:r>
-              <w:rPr>
-                <w:sz w:val="24"/>
-                <w:szCs w:val="24"/>
-              </w:rPr>
-              <w:t xml:space="preserve"> Ошибка авторизации. Неверный логин</w:t>
+              <w:t xml:space="preserve"> </w:t>
+            </w:r>
+            <w:r>
+              <w:rPr>
+                <w:sz w:val="24"/>
+                <w:szCs w:val="24"/>
+              </w:rPr>
+              <w:t>или пароль.</w:t>
             </w:r>
           </w:p>
         </w:tc>
@@ -3073,6 +3119,7 @@
               <w:rPr>
                 <w:sz w:val="24"/>
                 <w:szCs w:val="24"/>
+                <w:lang w:val="en-US"/>
               </w:rPr>
             </w:pPr>
             <w:r>
@@ -3080,7 +3127,41 @@
                 <w:sz w:val="24"/>
                 <w:szCs w:val="24"/>
               </w:rPr>
-              <w:t>Сообщение: Ошибка подключения</w:t>
+              <w:t>Сообщение</w:t>
+            </w:r>
+            <w:r>
+              <w:rPr>
+                <w:sz w:val="24"/>
+                <w:szCs w:val="24"/>
+                <w:lang w:val="en-US"/>
+              </w:rPr>
+              <w:t xml:space="preserve">: </w:t>
+            </w:r>
+            <w:r>
+              <w:rPr>
+                <w:sz w:val="24"/>
+                <w:szCs w:val="24"/>
+                <w:lang w:val="en-US"/>
+              </w:rPr>
+              <w:t xml:space="preserve">Failed to connect to </w:t>
+            </w:r>
+            <w:proofErr w:type="spellStart"/>
+            <w:r>
+              <w:rPr>
+                <w:sz w:val="24"/>
+                <w:szCs w:val="24"/>
+                <w:lang w:val="en-US"/>
+              </w:rPr>
+              <w:t>ip</w:t>
+            </w:r>
+            <w:proofErr w:type="spellEnd"/>
+            <w:r>
+              <w:rPr>
+                <w:sz w:val="24"/>
+                <w:szCs w:val="24"/>
+                <w:lang w:val="en-US"/>
+              </w:rPr>
+              <w:t>****</w:t>
             </w:r>
           </w:p>
         </w:tc>
@@ -3127,6 +3208,7 @@
               <w:rPr>
                 <w:sz w:val="24"/>
                 <w:szCs w:val="24"/>
+                <w:lang w:val="en-US"/>
               </w:rPr>
             </w:pPr>
             <w:r>
@@ -3134,7 +3216,41 @@
                 <w:sz w:val="24"/>
                 <w:szCs w:val="24"/>
               </w:rPr>
-              <w:t>Сообщение: Ошибка подключения</w:t>
+              <w:t>Сообщение</w:t>
+            </w:r>
+            <w:r>
+              <w:rPr>
+                <w:sz w:val="24"/>
+                <w:szCs w:val="24"/>
+                <w:lang w:val="en-US"/>
+              </w:rPr>
+              <w:t xml:space="preserve">: </w:t>
+            </w:r>
+            <w:r>
+              <w:rPr>
+                <w:sz w:val="24"/>
+                <w:szCs w:val="24"/>
+                <w:lang w:val="en-US"/>
+              </w:rPr>
+              <w:t xml:space="preserve">Failed to connect to </w:t>
+            </w:r>
+            <w:proofErr w:type="spellStart"/>
+            <w:r>
+              <w:rPr>
+                <w:sz w:val="24"/>
+                <w:szCs w:val="24"/>
+                <w:lang w:val="en-US"/>
+              </w:rPr>
+              <w:t>ip</w:t>
+            </w:r>
+            <w:proofErr w:type="spellEnd"/>
+            <w:r>
+              <w:rPr>
+                <w:sz w:val="24"/>
+                <w:szCs w:val="24"/>
+                <w:lang w:val="en-US"/>
+              </w:rPr>
+              <w:t>****</w:t>
             </w:r>
           </w:p>
         </w:tc>
@@ -3295,91 +3411,23 @@
                 <w:sz w:val="24"/>
                 <w:szCs w:val="24"/>
               </w:rPr>
-              <w:t>Ошибка авторизации. Неверный пароль.</w:t>
-            </w:r>
-          </w:p>
-        </w:tc>
-      </w:tr>
-      <w:tr>
-        <w:tc>
-          <w:tcPr>
-            <w:tcW w:w="4785" w:type="dxa"/>
-          </w:tcPr>
-          <w:p>
-            <w:pPr>
-              <w:jc w:val="left"/>
-              <w:rPr>
-                <w:sz w:val="24"/>
-                <w:szCs w:val="24"/>
-              </w:rPr>
-            </w:pPr>
-            <w:r>
-              <w:rPr>
-                <w:sz w:val="24"/>
-                <w:szCs w:val="24"/>
-              </w:rPr>
-              <w:t xml:space="preserve">На удаленном компьютере запущена служба </w:t>
-            </w:r>
-            <w:proofErr w:type="spellStart"/>
-            <w:r>
-              <w:rPr>
-                <w:sz w:val="24"/>
-                <w:szCs w:val="24"/>
-                <w:lang w:val="en-US"/>
-              </w:rPr>
-              <w:t>CredentialService</w:t>
-            </w:r>
-            <w:proofErr w:type="spellEnd"/>
-            <w:r>
-              <w:rPr>
-                <w:sz w:val="24"/>
-                <w:szCs w:val="24"/>
-              </w:rPr>
-              <w:t xml:space="preserve"> и нет активной сесси</w:t>
-            </w:r>
-            <w:proofErr w:type="gramStart"/>
-            <w:r>
-              <w:rPr>
-                <w:sz w:val="24"/>
-                <w:szCs w:val="24"/>
-              </w:rPr>
-              <w:t>и(</w:t>
-            </w:r>
-            <w:proofErr w:type="gramEnd"/>
-            <w:r>
-              <w:rPr>
-                <w:sz w:val="24"/>
-                <w:szCs w:val="24"/>
-              </w:rPr>
-              <w:t>другой пользователь вводит свои данные)</w:t>
-            </w:r>
-          </w:p>
-        </w:tc>
-        <w:tc>
-          <w:tcPr>
-            <w:tcW w:w="4786" w:type="dxa"/>
-          </w:tcPr>
-          <w:p>
-            <w:pPr>
-              <w:jc w:val="left"/>
-              <w:rPr>
-                <w:sz w:val="24"/>
-                <w:szCs w:val="24"/>
-              </w:rPr>
-            </w:pPr>
-            <w:r>
-              <w:rPr>
-                <w:sz w:val="24"/>
-                <w:szCs w:val="24"/>
-              </w:rPr>
-              <w:t>Сообщение:</w:t>
-            </w:r>
-            <w:r>
-              <w:rPr>
-                <w:sz w:val="24"/>
-                <w:szCs w:val="24"/>
-              </w:rPr>
-              <w:t xml:space="preserve"> Ошибка авторизации. Неверный пароль.</w:t>
+              <w:t xml:space="preserve">Ошибка авторизации. Неверный </w:t>
+            </w:r>
+            <w:r>
+              <w:rPr>
+                <w:sz w:val="24"/>
+                <w:szCs w:val="24"/>
+              </w:rPr>
+              <w:t xml:space="preserve">логин или </w:t>
+            </w:r>
+            <w:bookmarkStart w:id="0" w:name="_GoBack"/>
+            <w:bookmarkEnd w:id="0"/>
+            <w:r>
+              <w:rPr>
+                <w:sz w:val="24"/>
+                <w:szCs w:val="24"/>
+              </w:rPr>
+              <w:t>пароль.</w:t>
             </w:r>
           </w:p>
         </w:tc>
@@ -4878,6 +4926,7 @@
               <w:rPr>
                 <w:sz w:val="24"/>
                 <w:szCs w:val="24"/>
+                <w:lang w:val="en-US"/>
               </w:rPr>
             </w:pPr>
             <w:r>
@@ -4891,8 +4940,9 @@
               <w:rPr>
                 <w:sz w:val="24"/>
                 <w:szCs w:val="24"/>
-              </w:rPr>
-              <w:t>Неверный формат логина.</w:t>
+                <w:lang w:val="en-US"/>
+              </w:rPr>
+              <w:t>Wrong username format</w:t>
             </w:r>
           </w:p>
         </w:tc>
@@ -4942,8 +4992,16 @@
               <w:rPr>
                 <w:sz w:val="24"/>
                 <w:szCs w:val="24"/>
-              </w:rPr>
-              <w:t xml:space="preserve">Поле Логин не должно быть пустым </w:t>
+                <w:lang w:val="en-US"/>
+              </w:rPr>
+              <w:t>Enter username</w:t>
+            </w:r>
+            <w:r>
+              <w:rPr>
+                <w:sz w:val="24"/>
+                <w:szCs w:val="24"/>
+              </w:rPr>
+              <w:t xml:space="preserve"> </w:t>
             </w:r>
           </w:p>
         </w:tc>
@@ -5002,6 +5060,7 @@
               <w:rPr>
                 <w:sz w:val="24"/>
                 <w:szCs w:val="24"/>
+                <w:lang w:val="en-US"/>
               </w:rPr>
             </w:pPr>
             <w:r>
@@ -5009,22 +5068,45 @@
                 <w:sz w:val="24"/>
                 <w:szCs w:val="24"/>
               </w:rPr>
-              <w:t xml:space="preserve">Сообщение: </w:t>
-            </w:r>
-            <w:r>
-              <w:rPr>
-                <w:sz w:val="24"/>
-                <w:szCs w:val="24"/>
-              </w:rPr>
-              <w:t>Слишком длинное имя</w:t>
+              <w:t>Сообщение</w:t>
+            </w:r>
+            <w:r>
+              <w:rPr>
+                <w:sz w:val="24"/>
+                <w:szCs w:val="24"/>
+                <w:lang w:val="en-US"/>
+              </w:rPr>
+              <w:t xml:space="preserve">: </w:t>
+            </w:r>
+            <w:r>
+              <w:rPr>
+                <w:sz w:val="24"/>
+                <w:szCs w:val="24"/>
+                <w:lang w:val="en-US"/>
+              </w:rPr>
+              <w:t>Username is too long</w:t>
             </w:r>
           </w:p>
         </w:tc>
       </w:tr>
     </w:tbl>
-    <w:p/>
     <w:p>
-      <w:r>
+      <w:pPr>
+        <w:rPr>
+          <w:lang w:val="en-US"/>
+        </w:rPr>
+      </w:pPr>
+    </w:p>
+    <w:p>
+      <w:pPr>
+        <w:rPr>
+          <w:lang w:val="en-US"/>
+        </w:rPr>
+      </w:pPr>
+      <w:r>
+        <w:rPr>
+          <w:lang w:val="en-US"/>
+        </w:rPr>
         <w:br w:type="page"/>
       </w:r>
     </w:p>
@@ -5495,119 +5577,45 @@
             <w:pPr>
               <w:jc w:val="left"/>
               <w:rPr>
-                <w:color w:val="FF0000"/>
                 <w:sz w:val="24"/>
                 <w:szCs w:val="24"/>
               </w:rPr>
             </w:pPr>
             <w:r>
               <w:rPr>
-                <w:color w:val="FF0000"/>
-                <w:sz w:val="24"/>
-                <w:szCs w:val="24"/>
-              </w:rPr>
-              <w:t>Использование спецсимволов</w:t>
-            </w:r>
-            <w:proofErr w:type="gramStart"/>
-            <w:r>
-              <w:rPr>
-                <w:color w:val="FF0000"/>
-                <w:sz w:val="24"/>
-                <w:szCs w:val="24"/>
-              </w:rPr>
-              <w:t xml:space="preserve"> (</w:t>
-            </w:r>
-            <w:r>
-              <w:rPr>
-                <w:color w:val="FF0000"/>
-              </w:rPr>
-              <w:t>" / \ [ ] : ; | = , + * ? &lt; &gt;)</w:t>
-            </w:r>
-            <w:r>
-              <w:rPr>
-                <w:color w:val="FF0000"/>
-                <w:sz w:val="24"/>
-                <w:szCs w:val="24"/>
-              </w:rPr>
-              <w:t xml:space="preserve">. </w:t>
-            </w:r>
-            <w:proofErr w:type="gramEnd"/>
-            <w:r>
-              <w:rPr>
-                <w:color w:val="FF0000"/>
-                <w:sz w:val="24"/>
-                <w:szCs w:val="24"/>
-              </w:rPr>
-              <w:t xml:space="preserve">Примеры: </w:t>
-            </w:r>
-            <w:r>
-              <w:rPr>
-                <w:color w:val="FF0000"/>
+                <w:sz w:val="24"/>
+                <w:szCs w:val="24"/>
+              </w:rPr>
+              <w:t xml:space="preserve">Символов больше чем </w:t>
+            </w:r>
+            <w:r>
+              <w:rPr>
+                <w:sz w:val="24"/>
+                <w:szCs w:val="24"/>
+              </w:rPr>
+              <w:t>16</w:t>
+            </w:r>
+            <w:r>
+              <w:rPr>
+                <w:sz w:val="24"/>
+                <w:szCs w:val="24"/>
+              </w:rPr>
+              <w:t xml:space="preserve">. Примеры: </w:t>
+            </w:r>
+            <w:r>
+              <w:rPr>
                 <w:sz w:val="24"/>
                 <w:szCs w:val="24"/>
                 <w:lang w:val="en-US"/>
               </w:rPr>
-              <w:t>pass</w:t>
-            </w:r>
-            <w:r>
-              <w:rPr>
-                <w:color w:val="FF0000"/>
-                <w:sz w:val="24"/>
-                <w:szCs w:val="24"/>
-                <w:lang w:val="en-US"/>
-              </w:rPr>
-              <w:t>word</w:t>
-            </w:r>
-            <w:r>
-              <w:rPr>
-                <w:color w:val="FF0000"/>
-                <w:sz w:val="24"/>
-                <w:szCs w:val="24"/>
-              </w:rPr>
-              <w:t xml:space="preserve">? , </w:t>
-            </w:r>
-            <w:r>
-              <w:rPr>
-                <w:color w:val="FF0000"/>
-                <w:sz w:val="24"/>
-                <w:szCs w:val="24"/>
-                <w:lang w:val="en-US"/>
-              </w:rPr>
-              <w:t>pass</w:t>
-            </w:r>
-            <w:r>
-              <w:rPr>
-                <w:color w:val="FF0000"/>
-                <w:sz w:val="24"/>
-                <w:szCs w:val="24"/>
-                <w:lang w:val="en-US"/>
-              </w:rPr>
-              <w:t>word</w:t>
-            </w:r>
-            <w:r>
-              <w:rPr>
-                <w:color w:val="FF0000"/>
-                <w:sz w:val="24"/>
-                <w:szCs w:val="24"/>
-              </w:rPr>
-              <w:t>[] , ///</w:t>
-            </w:r>
-            <w:r>
-              <w:rPr>
-                <w:color w:val="FF0000"/>
-                <w:sz w:val="24"/>
-                <w:szCs w:val="24"/>
-                <w:lang w:val="en-US"/>
-              </w:rPr>
-              <w:t>pass</w:t>
-            </w:r>
-            <w:r>
-              <w:rPr>
-                <w:color w:val="FF0000"/>
-                <w:sz w:val="24"/>
-                <w:szCs w:val="24"/>
-              </w:rPr>
-              <w:t>///</w:t>
+              <w:t>test</w:t>
+            </w:r>
+            <w:r>
+              <w:rPr>
+                <w:sz w:val="24"/>
+                <w:szCs w:val="24"/>
+              </w:rPr>
+              <w:t>1234567890123456</w:t>
             </w:r>
           </w:p>
         </w:tc>
@@ -5619,18 +5627,58 @@
             <w:pPr>
               <w:jc w:val="left"/>
               <w:rPr>
-                <w:color w:val="FF0000"/>
                 <w:sz w:val="24"/>
                 <w:szCs w:val="24"/>
               </w:rPr>
             </w:pPr>
             <w:r>
               <w:rPr>
-                <w:color w:val="FF0000"/>
-                <w:sz w:val="24"/>
-                <w:szCs w:val="24"/>
-              </w:rPr>
-              <w:t>Сообщение: Неверный формат пароля.</w:t>
+                <w:sz w:val="24"/>
+                <w:szCs w:val="24"/>
+              </w:rPr>
+              <w:t xml:space="preserve">Сообщение: </w:t>
+            </w:r>
+            <w:r>
+              <w:rPr>
+                <w:sz w:val="24"/>
+                <w:szCs w:val="24"/>
+              </w:rPr>
+              <w:t>Слишком длинн</w:t>
+            </w:r>
+            <w:r>
+              <w:rPr>
+                <w:sz w:val="24"/>
+                <w:szCs w:val="24"/>
+              </w:rPr>
+              <w:t>ый</w:t>
+            </w:r>
+            <w:r>
+              <w:rPr>
+                <w:sz w:val="24"/>
+                <w:szCs w:val="24"/>
+              </w:rPr>
+              <w:t xml:space="preserve"> </w:t>
+            </w:r>
+            <w:r>
+              <w:rPr>
+                <w:sz w:val="24"/>
+                <w:szCs w:val="24"/>
+              </w:rPr>
+              <w:t xml:space="preserve">пароль. Длина должна быть не больше </w:t>
+            </w:r>
+            <w:r>
+              <w:rPr>
+                <w:sz w:val="24"/>
+                <w:szCs w:val="24"/>
+              </w:rPr>
+              <w:t>16</w:t>
+            </w:r>
+            <w:r>
+              <w:rPr>
+                <w:sz w:val="24"/>
+                <w:szCs w:val="24"/>
+              </w:rPr>
+              <w:t xml:space="preserve"> символов.</w:t>
             </w:r>
           </w:p>
         </w:tc>
@@ -5653,7 +5701,7 @@
                 <w:sz w:val="24"/>
                 <w:szCs w:val="24"/>
               </w:rPr>
-              <w:t xml:space="preserve">Символов больше чем 127. Примеры: </w:t>
+              <w:t xml:space="preserve">Длина пароля больше 0 и меньше 8 символов. Примеры: </w:t>
             </w:r>
             <w:r>
               <w:rPr>
@@ -5661,21 +5709,14 @@
                 <w:szCs w:val="24"/>
                 <w:lang w:val="en-US"/>
               </w:rPr>
-              <w:t>test</w:t>
-            </w:r>
-            <w:r>
-              <w:rPr>
-                <w:sz w:val="24"/>
-                <w:szCs w:val="24"/>
-              </w:rPr>
-              <w:t>12345678901234567890</w:t>
-            </w:r>
-            <w:r>
-              <w:rPr>
-                <w:sz w:val="24"/>
-                <w:szCs w:val="24"/>
-              </w:rPr>
-              <w:t>…</w:t>
+              <w:t>pass</w:t>
+            </w:r>
+            <w:r>
+              <w:rPr>
+                <w:sz w:val="24"/>
+                <w:szCs w:val="24"/>
+              </w:rPr>
+              <w:t xml:space="preserve"> </w:t>
             </w:r>
           </w:p>
         </w:tc>
@@ -5703,93 +5744,6 @@
                 <w:sz w:val="24"/>
                 <w:szCs w:val="24"/>
               </w:rPr>
-              <w:t>Слишком длинн</w:t>
-            </w:r>
-            <w:r>
-              <w:rPr>
-                <w:sz w:val="24"/>
-                <w:szCs w:val="24"/>
-              </w:rPr>
-              <w:t>ый</w:t>
-            </w:r>
-            <w:r>
-              <w:rPr>
-                <w:sz w:val="24"/>
-                <w:szCs w:val="24"/>
-              </w:rPr>
-              <w:t xml:space="preserve"> </w:t>
-            </w:r>
-            <w:r>
-              <w:rPr>
-                <w:sz w:val="24"/>
-                <w:szCs w:val="24"/>
-              </w:rPr>
-              <w:t>пароль. Длина должна быть не больше 127 символов.</w:t>
-            </w:r>
-          </w:p>
-        </w:tc>
-      </w:tr>
-      <w:tr>
-        <w:tc>
-          <w:tcPr>
-            <w:tcW w:w="4785" w:type="dxa"/>
-          </w:tcPr>
-          <w:p>
-            <w:pPr>
-              <w:jc w:val="left"/>
-              <w:rPr>
-                <w:sz w:val="24"/>
-                <w:szCs w:val="24"/>
-              </w:rPr>
-            </w:pPr>
-            <w:r>
-              <w:rPr>
-                <w:sz w:val="24"/>
-                <w:szCs w:val="24"/>
-              </w:rPr>
-              <w:t xml:space="preserve">Длина пароля больше 0 и меньше 8 символов. Примеры: </w:t>
-            </w:r>
-            <w:r>
-              <w:rPr>
-                <w:sz w:val="24"/>
-                <w:szCs w:val="24"/>
-                <w:lang w:val="en-US"/>
-              </w:rPr>
-              <w:t>pass</w:t>
-            </w:r>
-            <w:r>
-              <w:rPr>
-                <w:sz w:val="24"/>
-                <w:szCs w:val="24"/>
-              </w:rPr>
-              <w:t xml:space="preserve"> </w:t>
-            </w:r>
-          </w:p>
-        </w:tc>
-        <w:tc>
-          <w:tcPr>
-            <w:tcW w:w="4786" w:type="dxa"/>
-          </w:tcPr>
-          <w:p>
-            <w:pPr>
-              <w:jc w:val="left"/>
-              <w:rPr>
-                <w:sz w:val="24"/>
-                <w:szCs w:val="24"/>
-              </w:rPr>
-            </w:pPr>
-            <w:r>
-              <w:rPr>
-                <w:sz w:val="24"/>
-                <w:szCs w:val="24"/>
-              </w:rPr>
-              <w:t xml:space="preserve">Сообщение: </w:t>
-            </w:r>
-            <w:r>
-              <w:rPr>
-                <w:sz w:val="24"/>
-                <w:szCs w:val="24"/>
-              </w:rPr>
               <w:t xml:space="preserve">Пароль может быть либо </w:t>
             </w:r>
             <w:proofErr w:type="gramStart"/>
@@ -5838,28 +5792,7 @@
           <w:sz w:val="24"/>
           <w:szCs w:val="24"/>
         </w:rPr>
-        <w:t xml:space="preserve">кейс </w:t>
-      </w:r>
-      <w:r>
-        <w:rPr>
-          <w:sz w:val="24"/>
-          <w:szCs w:val="24"/>
-        </w:rPr>
-        <w:t>8</w:t>
-      </w:r>
-      <w:r>
-        <w:rPr>
-          <w:sz w:val="24"/>
-          <w:szCs w:val="24"/>
-        </w:rPr>
-        <w:t xml:space="preserve">. </w:t>
-      </w:r>
-      <w:r>
-        <w:rPr>
-          <w:sz w:val="24"/>
-          <w:szCs w:val="24"/>
-        </w:rPr>
-        <w:t>Одновременная попытка авторизации.</w:t>
+        <w:t>кейс 8. Одновременная попытка авторизации.</w:t>
       </w:r>
     </w:p>
     <w:p>
@@ -5963,14 +5896,7 @@
           <w:sz w:val="24"/>
           <w:szCs w:val="24"/>
         </w:rPr>
-        <w:t>втором</w:t>
-      </w:r>
-      <w:r>
-        <w:rPr>
-          <w:sz w:val="24"/>
-          <w:szCs w:val="24"/>
-        </w:rPr>
-        <w:t xml:space="preserve"> </w:t>
+        <w:t xml:space="preserve">втором </w:t>
       </w:r>
       <w:proofErr w:type="spellStart"/>
       <w:r>
@@ -5986,14 +5912,7 @@
           <w:sz w:val="24"/>
           <w:szCs w:val="24"/>
         </w:rPr>
-        <w:t xml:space="preserve"> устройстве</w:t>
-      </w:r>
-      <w:r>
-        <w:rPr>
-          <w:sz w:val="24"/>
-          <w:szCs w:val="24"/>
-        </w:rPr>
-        <w:t>.</w:t>
+        <w:t xml:space="preserve"> устройстве.</w:t>
       </w:r>
     </w:p>
     <w:p>
@@ -6219,15 +6138,7 @@
           <w:szCs w:val="24"/>
           <w:lang w:val="uk-UA"/>
         </w:rPr>
-        <w:t xml:space="preserve"> </w:t>
-      </w:r>
-      <w:r>
-        <w:rPr>
-          <w:sz w:val="24"/>
-          <w:szCs w:val="24"/>
-          <w:lang w:val="uk-UA"/>
-        </w:rPr>
-        <w:t xml:space="preserve">на </w:t>
+        <w:t xml:space="preserve"> на </w:t>
       </w:r>
       <w:proofErr w:type="spellStart"/>
       <w:r>
@@ -7067,14 +6978,7 @@
                 <w:sz w:val="24"/>
                 <w:szCs w:val="24"/>
               </w:rPr>
-              <w:t xml:space="preserve"> </w:t>
-            </w:r>
-            <w:r>
-              <w:rPr>
-                <w:sz w:val="24"/>
-                <w:szCs w:val="24"/>
-              </w:rPr>
-              <w:t>на обоих устройствах.</w:t>
+              <w:t xml:space="preserve"> на обоих устройствах.</w:t>
             </w:r>
           </w:p>
         </w:tc>
@@ -7158,14 +7062,7 @@
                 <w:sz w:val="24"/>
                 <w:szCs w:val="24"/>
               </w:rPr>
-              <w:t xml:space="preserve"> </w:t>
-            </w:r>
-            <w:r>
-              <w:rPr>
-                <w:sz w:val="24"/>
-                <w:szCs w:val="24"/>
-              </w:rPr>
-              <w:t>на обоих устройствах.</w:t>
+              <w:t xml:space="preserve"> на обоих устройствах.</w:t>
             </w:r>
           </w:p>
         </w:tc>
@@ -7249,44 +7146,7 @@
                 <w:sz w:val="24"/>
                 <w:szCs w:val="24"/>
               </w:rPr>
-              <w:t>Вы удачно авторизовались</w:t>
-            </w:r>
-            <w:proofErr w:type="gramStart"/>
-            <w:r>
-              <w:rPr>
-                <w:sz w:val="24"/>
-                <w:szCs w:val="24"/>
-              </w:rPr>
-              <w:t>.</w:t>
-            </w:r>
-            <w:proofErr w:type="gramEnd"/>
-            <w:r>
-              <w:rPr>
-                <w:sz w:val="24"/>
-                <w:szCs w:val="24"/>
-              </w:rPr>
-              <w:t xml:space="preserve"> На первом устройстве.</w:t>
-            </w:r>
-            <w:r>
-              <w:rPr>
-                <w:sz w:val="24"/>
-                <w:szCs w:val="24"/>
-              </w:rPr>
-              <w:t xml:space="preserve"> На удаленном компьютере началась активная сессия </w:t>
-            </w:r>
-            <w:r>
-              <w:rPr>
-                <w:sz w:val="24"/>
-                <w:szCs w:val="24"/>
-              </w:rPr>
-              <w:t>этого</w:t>
-            </w:r>
-            <w:r>
-              <w:rPr>
-                <w:sz w:val="24"/>
-                <w:szCs w:val="24"/>
-              </w:rPr>
-              <w:t xml:space="preserve"> </w:t>
+              <w:t xml:space="preserve">Вы удачно авторизовались. На первом устройстве. На удаленном компьютере началась активная сессия этого </w:t>
             </w:r>
             <w:proofErr w:type="spellStart"/>
             <w:r>
@@ -7332,166 +7192,8 @@
                 <w:sz w:val="24"/>
                 <w:szCs w:val="24"/>
               </w:rPr>
-              <w:t>**</w:t>
-            </w:r>
-            <w:r>
-              <w:rPr>
-                <w:sz w:val="24"/>
-                <w:szCs w:val="24"/>
-              </w:rPr>
-              <w:t xml:space="preserve"> на втором устройстве.</w:t>
-            </w:r>
-          </w:p>
-          <w:p>
-            <w:pPr>
-              <w:jc w:val="left"/>
-              <w:rPr>
-                <w:sz w:val="24"/>
-                <w:szCs w:val="24"/>
-              </w:rPr>
-            </w:pPr>
-          </w:p>
-        </w:tc>
-      </w:tr>
-      <w:tr>
-        <w:tc>
-          <w:tcPr>
-            <w:tcW w:w="4785" w:type="dxa"/>
-          </w:tcPr>
-          <w:p>
-            <w:pPr>
-              <w:jc w:val="left"/>
-              <w:rPr>
-                <w:sz w:val="24"/>
-                <w:szCs w:val="24"/>
-              </w:rPr>
-            </w:pPr>
-            <w:r>
-              <w:rPr>
-                <w:sz w:val="24"/>
-                <w:szCs w:val="24"/>
-              </w:rPr>
-              <w:lastRenderedPageBreak/>
-              <w:t xml:space="preserve">На удаленном компьютере запущена служба </w:t>
-            </w:r>
-            <w:proofErr w:type="spellStart"/>
-            <w:r>
-              <w:rPr>
-                <w:sz w:val="24"/>
-                <w:szCs w:val="24"/>
-                <w:lang w:val="en-US"/>
-              </w:rPr>
-              <w:t>CredentialService</w:t>
-            </w:r>
-            <w:proofErr w:type="spellEnd"/>
-            <w:r>
-              <w:rPr>
-                <w:sz w:val="24"/>
-                <w:szCs w:val="24"/>
-              </w:rPr>
-              <w:t xml:space="preserve"> и нет активной сесси</w:t>
-            </w:r>
-            <w:proofErr w:type="gramStart"/>
-            <w:r>
-              <w:rPr>
-                <w:sz w:val="24"/>
-                <w:szCs w:val="24"/>
-              </w:rPr>
-              <w:t>и(</w:t>
-            </w:r>
-            <w:proofErr w:type="gramEnd"/>
-            <w:r>
-              <w:rPr>
-                <w:sz w:val="24"/>
-                <w:szCs w:val="24"/>
-              </w:rPr>
-              <w:t>другой пользователь вводит свои данные)</w:t>
-            </w:r>
-          </w:p>
-        </w:tc>
-        <w:tc>
-          <w:tcPr>
-            <w:tcW w:w="4786" w:type="dxa"/>
-          </w:tcPr>
-          <w:p>
-            <w:pPr>
-              <w:jc w:val="left"/>
-              <w:rPr>
-                <w:sz w:val="24"/>
-                <w:szCs w:val="24"/>
-              </w:rPr>
-            </w:pPr>
-            <w:r>
-              <w:rPr>
-                <w:sz w:val="24"/>
-                <w:szCs w:val="24"/>
-              </w:rPr>
-              <w:t xml:space="preserve">Сообщение: </w:t>
-            </w:r>
-            <w:r>
-              <w:rPr>
-                <w:sz w:val="24"/>
-                <w:szCs w:val="24"/>
-              </w:rPr>
-              <w:t xml:space="preserve">Вы удачно авторизовались. На первом устройстве. На удаленном компьютере началась активная сессия этого </w:t>
-            </w:r>
-            <w:proofErr w:type="spellStart"/>
-            <w:r>
-              <w:rPr>
-                <w:sz w:val="24"/>
-                <w:szCs w:val="24"/>
-              </w:rPr>
-              <w:t>ИмяПользователя</w:t>
-            </w:r>
-            <w:proofErr w:type="spellEnd"/>
-            <w:r>
-              <w:rPr>
-                <w:sz w:val="24"/>
-                <w:szCs w:val="24"/>
-              </w:rPr>
-              <w:t>.</w:t>
-            </w:r>
-            <w:bookmarkStart w:id="0" w:name="_GoBack"/>
-            <w:bookmarkEnd w:id="0"/>
-          </w:p>
-          <w:p>
-            <w:pPr>
-              <w:jc w:val="left"/>
-              <w:rPr>
-                <w:sz w:val="24"/>
-                <w:szCs w:val="24"/>
-              </w:rPr>
-            </w:pPr>
-            <w:r>
-              <w:rPr>
-                <w:sz w:val="24"/>
-                <w:szCs w:val="24"/>
-              </w:rPr>
-              <w:t xml:space="preserve">Сообщение: </w:t>
-            </w:r>
-            <w:r>
-              <w:rPr>
-                <w:sz w:val="24"/>
-                <w:szCs w:val="24"/>
-              </w:rPr>
-              <w:t>Ошибка авторизации. Есть активная сессия пользователя ***</w:t>
-            </w:r>
-            <w:r>
-              <w:rPr>
-                <w:sz w:val="24"/>
-                <w:szCs w:val="24"/>
-              </w:rPr>
               <w:t>** на втором устройстве.</w:t>
             </w:r>
-          </w:p>
-          <w:p>
-            <w:pPr>
-              <w:jc w:val="left"/>
-              <w:rPr>
-                <w:sz w:val="24"/>
-                <w:szCs w:val="24"/>
-              </w:rPr>
-            </w:pPr>
           </w:p>
         </w:tc>
       </w:tr>

</xml_diff>